<commit_message>
docs: add steps 7-16 architecture diagrams and updated project plan
</commit_message>
<xml_diff>
--- a/docs/Project Plan - Tudor Rusu - Flavor 2.docx
+++ b/docs/Project Plan - Tudor Rusu - Flavor 2.docx
@@ -167,12 +167,44 @@
     </w:p>
     <w:p>
       <w:r>
-        <w:t>This project is a deep-dive solo assignment at Fontys University of Applied Sciences. The subject of investigation is AI caching strategies for LLM-based applications.</w:t>
+        <w:t xml:space="preserve">This project is a deep-dive solo assignment at Fontys University of Applied Sciences. The subject of investigation is AI </w:t>
+      </w:r>
+      <w:proofErr w:type="gramStart"/>
+      <w:r>
+        <w:t>caching</w:t>
+      </w:r>
+      <w:proofErr w:type="gramEnd"/>
+      <w:r>
+        <w:t xml:space="preserve"> strategies for LLM-based applications.</w:t>
       </w:r>
     </w:p>
     <w:p>
       <w:r>
-        <w:t xml:space="preserve">The starting point is an AI-powered cybersecurity data breach analyst assistant built in Python using LangChain, OpenAI GPT-4o, ChromaDB and Streamlit. Aegis was developed across 16 incremental steps (Flavor 1), growing from a basic LLM chat interface into a full multi-agent system with RAG-based retrieval, tool use, agentic workflows, human-in-the-loop approval, multimodal input and agent-to-agent communication over HTTP. It provides a realistic LLM application to use </w:t>
+        <w:t xml:space="preserve">The starting point is an AI-powered cybersecurity data breach analyst assistant built in Python using </w:t>
+      </w:r>
+      <w:proofErr w:type="spellStart"/>
+      <w:r>
+        <w:t>LangChain</w:t>
+      </w:r>
+      <w:proofErr w:type="spellEnd"/>
+      <w:r>
+        <w:t xml:space="preserve">, OpenAI GPT-4o, </w:t>
+      </w:r>
+      <w:proofErr w:type="spellStart"/>
+      <w:r>
+        <w:t>ChromaDB</w:t>
+      </w:r>
+      <w:proofErr w:type="spellEnd"/>
+      <w:r>
+        <w:t xml:space="preserve"> and </w:t>
+      </w:r>
+      <w:proofErr w:type="spellStart"/>
+      <w:r>
+        <w:t>Streamlit</w:t>
+      </w:r>
+      <w:proofErr w:type="spellEnd"/>
+      <w:r>
+        <w:t xml:space="preserve">. Aegis was developed across 16 incremental steps (Flavor 1), growing from a basic LLM chat interface into a full multi-agent system with RAG-based retrieval, tool use, agentic workflows, human-in-the-loop approval, multimodal input and agent-to-agent communication over HTTP. It provides a realistic LLM application to use </w:t>
       </w:r>
       <w:r>
         <w:t>for</w:t>
@@ -183,13 +215,37 @@
     </w:p>
     <w:p>
       <w:r>
-        <w:t xml:space="preserve">LLM-based applications face a structural cost and latency problem: every user query triggers one or more API calls to an external model provider, each taking 1-10 seconds and incurring per-token costs. Many of these calls are for semantically similar or identical inputs. Caching is the natural solution, but naive key-value caching does not work for language </w:t>
+        <w:t xml:space="preserve">LLM-based applications face a structural cost and latency problem: every user query triggers one or more API calls to an external model provider, each taking 1-10 seconds and incurring per-token costs. Many of these calls are for semantically similar or identical inputs. Caching is the natural solution, but naive key-value </w:t>
+      </w:r>
+      <w:proofErr w:type="gramStart"/>
+      <w:r>
+        <w:t>caching</w:t>
+      </w:r>
+      <w:proofErr w:type="gramEnd"/>
+      <w:r>
+        <w:t xml:space="preserve"> does not work for language </w:t>
       </w:r>
       <w:r>
         <w:t>meaning that</w:t>
       </w:r>
       <w:r>
-        <w:t xml:space="preserve"> two queries that mean the same thing rarely have the same string. This project investigates what caching strategies are available for LLM-based systems, how they differ and which are most effective for a RAG pipeline like Aegis.</w:t>
+        <w:t xml:space="preserve"> two queries that mean the same thing rarely have the same string. This project investigates what </w:t>
+      </w:r>
+      <w:proofErr w:type="gramStart"/>
+      <w:r>
+        <w:t>caching</w:t>
+      </w:r>
+      <w:proofErr w:type="gramEnd"/>
+      <w:r>
+        <w:t xml:space="preserve"> strategies are available for LLM-based systems, how they differ and which are most effective for </w:t>
+      </w:r>
+      <w:proofErr w:type="gramStart"/>
+      <w:r>
+        <w:t>a RAG</w:t>
+      </w:r>
+      <w:proofErr w:type="gramEnd"/>
+      <w:r>
+        <w:t xml:space="preserve"> pipeline like Aegis.</w:t>
       </w:r>
     </w:p>
     <w:p>
@@ -197,7 +253,15 @@
         <w:t xml:space="preserve">To implement and evaluate caching strategies, the Aegis codebase must first be refactored into a testable, modular form. This is done by applying SOLID design principles and Test-Driven Development. Approval tests capture the current system behavior before refactoring begins, ensuring the caching implementation does not alter existing functionality. </w:t>
       </w:r>
       <w:r>
-        <w:t>A full CI/CD pipeline using GitHub Actions and Streamlit Community Cloud enforces code quality and automatic deployment.</w:t>
+        <w:t xml:space="preserve">A full CI/CD pipeline using GitHub Actions and </w:t>
+      </w:r>
+      <w:proofErr w:type="spellStart"/>
+      <w:r>
+        <w:t>Streamlit</w:t>
+      </w:r>
+      <w:proofErr w:type="spellEnd"/>
+      <w:r>
+        <w:t xml:space="preserve"> Community Cloud enforces code quality and automatic deployment.</w:t>
       </w:r>
     </w:p>
     <w:p>
@@ -224,7 +288,15 @@
         <w:pStyle w:val="ListBullet"/>
       </w:pPr>
       <w:r>
-        <w:t>Refactor the Aegis codebase using SOLID principles to create a modular, testable foundation for caching implementation.</w:t>
+        <w:t xml:space="preserve">Refactor the Aegis codebase using SOLID principles to create a modular, testable foundation for </w:t>
+      </w:r>
+      <w:proofErr w:type="gramStart"/>
+      <w:r>
+        <w:t>caching</w:t>
+      </w:r>
+      <w:proofErr w:type="gramEnd"/>
+      <w:r>
+        <w:t xml:space="preserve"> implementation.</w:t>
       </w:r>
     </w:p>
     <w:p>
@@ -261,7 +333,15 @@
     </w:p>
     <w:p>
       <w:r>
-        <w:t>Research the landscape of AI caching strategies applicable to LLM-based RAG pipelines including semantic caching, prompt caching, embedding caching, and TTL-based in-memory caching. Implement at least two candidate strategies within the Aegis pipeline and benchmark them against the uncached baseline, measuring latency reduction and cache hit rate on a representative query set.</w:t>
+        <w:t xml:space="preserve">Research the landscape of AI caching strategies applicable to LLM-based RAG pipelines including semantic caching, prompt caching, embedding caching and TTL-based in-memory caching. Implement at least two candidate strategies within the Aegis pipeline and benchmark them against the </w:t>
+      </w:r>
+      <w:proofErr w:type="spellStart"/>
+      <w:r>
+        <w:t>uncached</w:t>
+      </w:r>
+      <w:proofErr w:type="spellEnd"/>
+      <w:r>
+        <w:t xml:space="preserve"> baseline, measuring latency reduction and cache hit rate on a representative query set.</w:t>
       </w:r>
     </w:p>
     <w:p>
@@ -271,13 +351,34 @@
       <w:r>
         <w:t xml:space="preserve"> </w:t>
       </w:r>
-      <w:r>
-        <w:t>Deploy the application to Streamlit Community Cloud as the continuous deployment stage, triggered automatically when CI passes.</w:t>
+      <w:proofErr w:type="gramStart"/>
+      <w:r>
+        <w:t>Deploy</w:t>
+      </w:r>
+      <w:proofErr w:type="gramEnd"/>
+      <w:r>
+        <w:t xml:space="preserve"> the application to </w:t>
+      </w:r>
+      <w:proofErr w:type="spellStart"/>
+      <w:r>
+        <w:t>Streamlit</w:t>
+      </w:r>
+      <w:proofErr w:type="spellEnd"/>
+      <w:r>
+        <w:t xml:space="preserve"> Community Cloud as the continuous deployment stage, triggered automatically when CI passes.</w:t>
       </w:r>
     </w:p>
     <w:p>
       <w:r>
-        <w:t>Minimum requirements for the end result:</w:t>
+        <w:t xml:space="preserve">Minimum requirements for </w:t>
+      </w:r>
+      <w:proofErr w:type="gramStart"/>
+      <w:r>
+        <w:t>the end result</w:t>
+      </w:r>
+      <w:proofErr w:type="gramEnd"/>
+      <w:r>
+        <w:t>:</w:t>
       </w:r>
     </w:p>
     <w:p>
@@ -285,7 +386,15 @@
         <w:pStyle w:val="ListBullet"/>
       </w:pPr>
       <w:r>
-        <w:t xml:space="preserve">Research document comparing evaluated AI caching strategies with </w:t>
+        <w:t xml:space="preserve">Research document comparing evaluated AI </w:t>
+      </w:r>
+      <w:proofErr w:type="gramStart"/>
+      <w:r>
+        <w:t>caching</w:t>
+      </w:r>
+      <w:proofErr w:type="gramEnd"/>
+      <w:r>
+        <w:t xml:space="preserve"> strategies with </w:t>
       </w:r>
       <w:r>
         <w:t>arguments</w:t>
@@ -299,7 +408,15 @@
         <w:pStyle w:val="ListBullet"/>
       </w:pPr>
       <w:r>
-        <w:t>At least two caching strategies implemented and benchmarked against the uncached baseline.</w:t>
+        <w:t xml:space="preserve">At least two caching strategies implemented and benchmarked against the </w:t>
+      </w:r>
+      <w:proofErr w:type="spellStart"/>
+      <w:r>
+        <w:t>uncached</w:t>
+      </w:r>
+      <w:proofErr w:type="spellEnd"/>
+      <w:r>
+        <w:t xml:space="preserve"> baseline.</w:t>
       </w:r>
     </w:p>
     <w:p>
@@ -331,7 +448,15 @@
         <w:pStyle w:val="ListBullet"/>
       </w:pPr>
       <w:r>
-        <w:t>Automatic redeployment to Streamlit Community Cloud when CI passes.</w:t>
+        <w:t xml:space="preserve">Automatic redeployment to </w:t>
+      </w:r>
+      <w:proofErr w:type="spellStart"/>
+      <w:r>
+        <w:t>Streamlit</w:t>
+      </w:r>
+      <w:proofErr w:type="spellEnd"/>
+      <w:r>
+        <w:t xml:space="preserve"> Community Cloud when CI passes.</w:t>
       </w:r>
       <w:r>
         <w:br/>
@@ -391,13 +516,25 @@
         <w:pStyle w:val="ListBullet"/>
       </w:pPr>
       <w:r>
-        <w:t>Unit and integration test suite using pytest and approvaltests with a 90% coverage gate</w:t>
-      </w:r>
-      <w:r>
-        <w:t xml:space="preserve"> </w:t>
-      </w:r>
-      <w:r>
-        <w:t>GitHub Actions CI pipeline with lint, test and coverage gate stages.</w:t>
+        <w:t xml:space="preserve">Unit and integration test suite using </w:t>
+      </w:r>
+      <w:proofErr w:type="spellStart"/>
+      <w:r>
+        <w:t>pytest</w:t>
+      </w:r>
+      <w:proofErr w:type="spellEnd"/>
+      <w:r>
+        <w:t xml:space="preserve"> and </w:t>
+      </w:r>
+      <w:proofErr w:type="spellStart"/>
+      <w:proofErr w:type="gramStart"/>
+      <w:r>
+        <w:t>approvaltests</w:t>
+      </w:r>
+      <w:proofErr w:type="spellEnd"/>
+      <w:proofErr w:type="gramEnd"/>
+      <w:r>
+        <w:t xml:space="preserve"> with a 90% coverage gate GitHub Actions CI pipeline with lint, test and coverage gate stages.</w:t>
       </w:r>
     </w:p>
     <w:p>
@@ -405,7 +542,15 @@
         <w:pStyle w:val="ListBullet"/>
       </w:pPr>
       <w:r>
-        <w:t>Automatic redeployment to Streamlit Community Cloud when CI passes.</w:t>
+        <w:t xml:space="preserve">Automatic redeployment to </w:t>
+      </w:r>
+      <w:proofErr w:type="spellStart"/>
+      <w:r>
+        <w:t>Streamlit</w:t>
+      </w:r>
+      <w:proofErr w:type="spellEnd"/>
+      <w:r>
+        <w:t xml:space="preserve"> Community Cloud when CI passes.</w:t>
       </w:r>
     </w:p>
     <w:p>
@@ -413,7 +558,15 @@
         <w:pStyle w:val="ListBullet"/>
       </w:pPr>
       <w:r>
-        <w:t>Deployment of the Aegis application to Streamlit Community Cloud as the CD stage.</w:t>
+        <w:t xml:space="preserve">Deployment of the Aegis application to </w:t>
+      </w:r>
+      <w:proofErr w:type="spellStart"/>
+      <w:r>
+        <w:t>Streamlit</w:t>
+      </w:r>
+      <w:proofErr w:type="spellEnd"/>
+      <w:r>
+        <w:t xml:space="preserve"> Community Cloud as the CD stage.</w:t>
       </w:r>
     </w:p>
     <w:p>
@@ -453,7 +606,15 @@
         <w:pStyle w:val="ListBullet"/>
       </w:pPr>
       <w:r>
-        <w:t>Multi-user access, authentication or authorisation features.</w:t>
+        <w:t xml:space="preserve">Multi-user access, authentication or </w:t>
+      </w:r>
+      <w:proofErr w:type="spellStart"/>
+      <w:r>
+        <w:t>authorisation</w:t>
+      </w:r>
+      <w:proofErr w:type="spellEnd"/>
+      <w:r>
+        <w:t xml:space="preserve"> features.</w:t>
       </w:r>
     </w:p>
     <w:p>
@@ -469,7 +630,31 @@
         <w:pStyle w:val="ListBullet"/>
       </w:pPr>
       <w:r>
-        <w:t>The existing Python technology stack (LangChain, OpenAI, ChromaDB, Streamlit) must be preserved.</w:t>
+        <w:t>The existing Python technology stack (</w:t>
+      </w:r>
+      <w:proofErr w:type="spellStart"/>
+      <w:r>
+        <w:t>LangChain</w:t>
+      </w:r>
+      <w:proofErr w:type="spellEnd"/>
+      <w:r>
+        <w:t xml:space="preserve">, OpenAI, </w:t>
+      </w:r>
+      <w:proofErr w:type="spellStart"/>
+      <w:r>
+        <w:t>ChromaDB</w:t>
+      </w:r>
+      <w:proofErr w:type="spellEnd"/>
+      <w:r>
+        <w:t xml:space="preserve">, </w:t>
+      </w:r>
+      <w:proofErr w:type="spellStart"/>
+      <w:r>
+        <w:t>Streamlit</w:t>
+      </w:r>
+      <w:proofErr w:type="spellEnd"/>
+      <w:r>
+        <w:t>) must be preserved.</w:t>
       </w:r>
     </w:p>
     <w:p>
@@ -516,8 +701,13 @@
       <w:pPr>
         <w:pStyle w:val="ListBullet"/>
       </w:pPr>
-      <w:r>
-        <w:t>Caching benchmarks must use a fixed, reproducible query set to ensure results are comparable.</w:t>
+      <w:proofErr w:type="gramStart"/>
+      <w:r>
+        <w:t>Caching</w:t>
+      </w:r>
+      <w:proofErr w:type="gramEnd"/>
+      <w:r>
+        <w:t xml:space="preserve"> benchmarks must use a fixed, reproducible query set to ensure results are comparable.</w:t>
       </w:r>
     </w:p>
     <w:p>
@@ -572,8 +762,13 @@
             <w:tcW w:w="4320" w:type="dxa"/>
           </w:tcPr>
           <w:p>
-            <w:r>
-              <w:t>Caching research document</w:t>
+            <w:proofErr w:type="gramStart"/>
+            <w:r>
+              <w:t>Caching</w:t>
+            </w:r>
+            <w:proofErr w:type="gramEnd"/>
+            <w:r>
+              <w:t xml:space="preserve"> research document</w:t>
             </w:r>
           </w:p>
         </w:tc>
@@ -583,7 +778,15 @@
           </w:tcPr>
           <w:p>
             <w:r>
-              <w:t xml:space="preserve">Comparison of evaluated AI caching strategies, benchmark results </w:t>
+              <w:t xml:space="preserve">Comparison of evaluated AI </w:t>
+            </w:r>
+            <w:proofErr w:type="gramStart"/>
+            <w:r>
+              <w:t>caching</w:t>
+            </w:r>
+            <w:proofErr w:type="gramEnd"/>
+            <w:r>
+              <w:t xml:space="preserve"> strategies, benchmark results </w:t>
             </w:r>
             <w:r>
               <w:t xml:space="preserve">with arguments </w:t>
@@ -678,13 +881,15 @@
           </w:tcPr>
           <w:p>
             <w:r>
-              <w:t xml:space="preserve">GitHub Actions (CI): lint </w:t>
-            </w:r>
-            <w:r>
-              <w:t>-&gt;</w:t>
-            </w:r>
-            <w:r>
-              <w:t xml:space="preserve"> test -&gt; coverage gate on every push to main. Streamlit Community Cloud (CD): automatic redeploy when CI passes.</w:t>
+              <w:t xml:space="preserve">GitHub Actions (CI): lint -&gt; test -&gt; coverage gate on every push to main. </w:t>
+            </w:r>
+            <w:proofErr w:type="spellStart"/>
+            <w:r>
+              <w:t>Streamlit</w:t>
+            </w:r>
+            <w:proofErr w:type="spellEnd"/>
+            <w:r>
+              <w:t xml:space="preserve"> Community Cloud (CD): automatic redeploy when CI passes.</w:t>
             </w:r>
           </w:p>
         </w:tc>
@@ -886,19 +1091,15 @@
     </w:p>
     <w:p>
       <w:r>
-        <w:t>CI/CD is fully automated</w:t>
-      </w:r>
-      <w:r>
-        <w:t>,</w:t>
-      </w:r>
-      <w:r>
-        <w:t xml:space="preserve"> GitHub Actions handles continuous integration (lint, tests, 90% coverage gate) and Streamlit Community Cloud handles continuous deployment</w:t>
-      </w:r>
-      <w:r>
-        <w:t>,</w:t>
-      </w:r>
-      <w:r>
-        <w:t xml:space="preserve"> every push to main that passes CI is automatically redeployed to the live application.</w:t>
+        <w:t xml:space="preserve">CI/CD is fully automated, GitHub Actions handles continuous integration (lint, tests, 90% coverage gate) and </w:t>
+      </w:r>
+      <w:proofErr w:type="spellStart"/>
+      <w:r>
+        <w:t>Streamlit</w:t>
+      </w:r>
+      <w:proofErr w:type="spellEnd"/>
+      <w:r>
+        <w:t xml:space="preserve"> Community Cloud handles continuous deployment, every push to main that passes CI is automatically redeployed to the live application.</w:t>
       </w:r>
     </w:p>
     <w:p>
@@ -971,7 +1172,15 @@
         <w:pStyle w:val="ListBullet"/>
       </w:pPr>
       <w:r>
-        <w:t>Integration tests run against real components (ChromaDB retriever) but with the OpenAI API mocked.</w:t>
+        <w:t>Integration tests run against real components (</w:t>
+      </w:r>
+      <w:proofErr w:type="spellStart"/>
+      <w:r>
+        <w:t>ChromaDB</w:t>
+      </w:r>
+      <w:proofErr w:type="spellEnd"/>
+      <w:r>
+        <w:t xml:space="preserve"> retriever) but with the OpenAI API mocked.</w:t>
       </w:r>
     </w:p>
     <w:p>
@@ -1132,8 +1341,13 @@
             <w:r>
               <w:t xml:space="preserve"> + </w:t>
             </w:r>
-            <w:r>
-              <w:t>Streamlit Community Cloud CD setup.</w:t>
+            <w:proofErr w:type="spellStart"/>
+            <w:r>
+              <w:t>Streamlit</w:t>
+            </w:r>
+            <w:proofErr w:type="spellEnd"/>
+            <w:r>
+              <w:t xml:space="preserve"> Community Cloud CD setup.</w:t>
             </w:r>
           </w:p>
         </w:tc>
@@ -1324,10 +1538,15 @@
               <w:t xml:space="preserve"> +</w:t>
             </w:r>
             <w:r>
-              <w:t xml:space="preserve"> </w:t>
-            </w:r>
-            <w:r>
-              <w:t>set up Streamlit Community Cloud CD</w:t>
+              <w:t xml:space="preserve"> set up </w:t>
+            </w:r>
+            <w:proofErr w:type="spellStart"/>
+            <w:r>
+              <w:t>Streamlit</w:t>
+            </w:r>
+            <w:proofErr w:type="spellEnd"/>
+            <w:r>
+              <w:t xml:space="preserve"> Community Cloud CD</w:t>
             </w:r>
             <w:r>
               <w:t xml:space="preserve"> + </w:t>
@@ -1384,7 +1603,15 @@
               <w:t xml:space="preserve"> +</w:t>
             </w:r>
             <w:r>
-              <w:t xml:space="preserve"> benchmark both against uncached baseline</w:t>
+              <w:t xml:space="preserve"> benchmark both against </w:t>
+            </w:r>
+            <w:proofErr w:type="spellStart"/>
+            <w:r>
+              <w:t>uncached</w:t>
+            </w:r>
+            <w:proofErr w:type="spellEnd"/>
+            <w:r>
+              <w:t xml:space="preserve"> baseline</w:t>
             </w:r>
             <w:r>
               <w:t xml:space="preserve"> +</w:t>
@@ -1504,8 +1731,13 @@
           </w:tcPr>
           <w:p>
             <w:r>
-              <w:t>Erik van der Schriek</w:t>
-            </w:r>
+              <w:t xml:space="preserve">Erik van der </w:t>
+            </w:r>
+            <w:proofErr w:type="spellStart"/>
+            <w:r>
+              <w:t>Schriek</w:t>
+            </w:r>
+            <w:proofErr w:type="spellEnd"/>
           </w:p>
         </w:tc>
         <w:tc>
@@ -1646,8 +1878,13 @@
           </w:tcPr>
           <w:p>
             <w:r>
-              <w:t>Windows 11, Python 3.11, venv</w:t>
-            </w:r>
+              <w:t xml:space="preserve">Windows 11, Python 3.11, </w:t>
+            </w:r>
+            <w:proofErr w:type="spellStart"/>
+            <w:r>
+              <w:t>venv</w:t>
+            </w:r>
+            <w:proofErr w:type="spellEnd"/>
           </w:p>
         </w:tc>
         <w:tc>
@@ -1677,8 +1914,13 @@
             <w:tcW w:w="2880" w:type="dxa"/>
           </w:tcPr>
           <w:p>
-            <w:r>
-              <w:t>ChromaDB persistent (local disk)</w:t>
+            <w:proofErr w:type="spellStart"/>
+            <w:r>
+              <w:t>ChromaDB</w:t>
+            </w:r>
+            <w:proofErr w:type="spellEnd"/>
+            <w:r>
+              <w:t xml:space="preserve"> persistent (local disk)</w:t>
             </w:r>
           </w:p>
         </w:tc>
@@ -1687,8 +1929,13 @@
             <w:tcW w:w="2880" w:type="dxa"/>
           </w:tcPr>
           <w:p>
-            <w:r>
-              <w:t>ChromaDB in-memory instance</w:t>
+            <w:proofErr w:type="spellStart"/>
+            <w:r>
+              <w:t>ChromaDB</w:t>
+            </w:r>
+            <w:proofErr w:type="spellEnd"/>
+            <w:r>
+              <w:t xml:space="preserve"> in-memory instance</w:t>
             </w:r>
           </w:p>
         </w:tc>
@@ -1784,8 +2031,13 @@
           </w:tcPr>
           <w:p>
             <w:r>
-              <w:t>Started as subprocess pytest</w:t>
-            </w:r>
+              <w:t xml:space="preserve">Started as subprocess </w:t>
+            </w:r>
+            <w:proofErr w:type="spellStart"/>
+            <w:r>
+              <w:t>pytest</w:t>
+            </w:r>
+            <w:proofErr w:type="spellEnd"/>
           </w:p>
         </w:tc>
       </w:tr>
@@ -1805,8 +2057,13 @@
             <w:tcW w:w="2880" w:type="dxa"/>
           </w:tcPr>
           <w:p>
-            <w:r>
-              <w:t>pytest (local)</w:t>
+            <w:proofErr w:type="spellStart"/>
+            <w:r>
+              <w:t>pytest</w:t>
+            </w:r>
+            <w:proofErr w:type="spellEnd"/>
+            <w:r>
+              <w:t xml:space="preserve"> (local)</w:t>
             </w:r>
           </w:p>
         </w:tc>
@@ -1815,8 +2072,13 @@
             <w:tcW w:w="2880" w:type="dxa"/>
           </w:tcPr>
           <w:p>
-            <w:r>
-              <w:t>pytest via GitHub Actions workflow</w:t>
+            <w:proofErr w:type="spellStart"/>
+            <w:r>
+              <w:t>pytest</w:t>
+            </w:r>
+            <w:proofErr w:type="spellEnd"/>
+            <w:r>
+              <w:t xml:space="preserve"> via GitHub Actions workflow</w:t>
             </w:r>
           </w:p>
         </w:tc>
@@ -1847,12 +2109,19 @@
             <w:tcW w:w="2880" w:type="dxa"/>
           </w:tcPr>
           <w:p>
-            <w:r>
-              <w:t>Streamlit Community Cloud</w:t>
-            </w:r>
-            <w:r>
-              <w:t xml:space="preserve"> autodeploy</w:t>
-            </w:r>
+            <w:proofErr w:type="spellStart"/>
+            <w:r>
+              <w:t>Streamlit</w:t>
+            </w:r>
+            <w:proofErr w:type="spellEnd"/>
+            <w:r>
+              <w:t xml:space="preserve"> Community Cloud </w:t>
+            </w:r>
+            <w:proofErr w:type="spellStart"/>
+            <w:r>
+              <w:t>autodeploy</w:t>
+            </w:r>
+            <w:proofErr w:type="spellEnd"/>
           </w:p>
         </w:tc>
       </w:tr>
@@ -1906,7 +2175,31 @@
         <w:pStyle w:val="ListBullet"/>
       </w:pPr>
       <w:r>
-        <w:t>Commit convention: Conventional Commits (feat:, fix:, test:, refactor:).</w:t>
+        <w:t>Commit convention: Conventional Commits (</w:t>
+      </w:r>
+      <w:proofErr w:type="gramStart"/>
+      <w:r>
+        <w:t>feat:,</w:t>
+      </w:r>
+      <w:proofErr w:type="gramEnd"/>
+      <w:r>
+        <w:t xml:space="preserve"> </w:t>
+      </w:r>
+      <w:proofErr w:type="gramStart"/>
+      <w:r>
+        <w:t>fix:,</w:t>
+      </w:r>
+      <w:proofErr w:type="gramEnd"/>
+      <w:r>
+        <w:t xml:space="preserve"> </w:t>
+      </w:r>
+      <w:proofErr w:type="gramStart"/>
+      <w:r>
+        <w:t>test:,</w:t>
+      </w:r>
+      <w:proofErr w:type="gramEnd"/>
+      <w:r>
+        <w:t xml:space="preserve"> refactor:).</w:t>
       </w:r>
     </w:p>
     <w:p>
@@ -1922,11 +2215,21 @@
       <w:pPr>
         <w:pStyle w:val="ListBullet"/>
       </w:pPr>
-      <w:r>
-        <w:t xml:space="preserve">Streamlit Community Cloud connected to the GitHub repository </w:t>
-      </w:r>
-      <w:r>
-        <w:t>and autodeploys when pushing to main</w:t>
+      <w:proofErr w:type="spellStart"/>
+      <w:r>
+        <w:t>Streamlit</w:t>
+      </w:r>
+      <w:proofErr w:type="spellEnd"/>
+      <w:r>
+        <w:t xml:space="preserve"> Community Cloud connected to the GitHub repository and </w:t>
+      </w:r>
+      <w:proofErr w:type="spellStart"/>
+      <w:r>
+        <w:t>autodeploys</w:t>
+      </w:r>
+      <w:proofErr w:type="spellEnd"/>
+      <w:r>
+        <w:t xml:space="preserve"> when pushing to main</w:t>
       </w:r>
     </w:p>
     <w:p>
@@ -2064,7 +2367,15 @@
           </w:tcPr>
           <w:p>
             <w:r>
-              <w:t>Fixed query set run against uncached baseline + each cached variant. Bounded cost.</w:t>
+              <w:t xml:space="preserve">Fixed query set run against </w:t>
+            </w:r>
+            <w:proofErr w:type="spellStart"/>
+            <w:r>
+              <w:t>uncached</w:t>
+            </w:r>
+            <w:proofErr w:type="spellEnd"/>
+            <w:r>
+              <w:t xml:space="preserve"> baseline + each cached variant. Bounded cost.</w:t>
             </w:r>
           </w:p>
         </w:tc>
@@ -2096,7 +2407,15 @@
           </w:tcPr>
           <w:p>
             <w:r>
-              <w:t>Free tier is sufficient for a solo project.</w:t>
+              <w:t xml:space="preserve">Free </w:t>
+            </w:r>
+            <w:proofErr w:type="gramStart"/>
+            <w:r>
+              <w:t>tier</w:t>
+            </w:r>
+            <w:proofErr w:type="gramEnd"/>
+            <w:r>
+              <w:t xml:space="preserve"> is sufficient for a solo project.</w:t>
             </w:r>
           </w:p>
         </w:tc>
@@ -2139,8 +2458,13 @@
             <w:tcW w:w="2880" w:type="dxa"/>
           </w:tcPr>
           <w:p>
-            <w:r>
-              <w:t>Streamlit Community Cloud</w:t>
+            <w:proofErr w:type="spellStart"/>
+            <w:r>
+              <w:t>Streamlit</w:t>
+            </w:r>
+            <w:proofErr w:type="spellEnd"/>
+            <w:r>
+              <w:t xml:space="preserve"> Community Cloud</w:t>
             </w:r>
           </w:p>
         </w:tc>
@@ -2160,7 +2484,15 @@
           </w:tcPr>
           <w:p>
             <w:r>
-              <w:t>Free tier sufficient for a solo project.</w:t>
+              <w:t xml:space="preserve">Free </w:t>
+            </w:r>
+            <w:proofErr w:type="gramStart"/>
+            <w:r>
+              <w:t>tier</w:t>
+            </w:r>
+            <w:proofErr w:type="gramEnd"/>
+            <w:r>
+              <w:t xml:space="preserve"> sufficient for a solo project.</w:t>
             </w:r>
           </w:p>
         </w:tc>

</xml_diff>

<commit_message>
ci: set up GitHub Actions CI pipeline AG-11 #done
* ci: create GitHub Actions workflow file AG-31 #done

* ci: test Jira integration AG-31

* ci: test Jira link AG-31

* ci: add ruff linting stage AG-32

* ci: add ruff linting stage AG-32 #done

* ci: add pytest stage AG-33 #done

* ci: add pytest and testing dependencies to requirements AG-33 #done

* ci: fix pytest stage to pass when no tests exist yet AG-33 #done

* ci: add coverage gate at 0% AG-34

* ci: handle no tests exit code in coverage stage AG-34 #done

---------

Co-authored-by: Tudor <I438993@fhict.nl>
</commit_message>
<xml_diff>
--- a/docs/Project Plan - Tudor Rusu - Flavor 2.docx
+++ b/docs/Project Plan - Tudor Rusu - Flavor 2.docx
@@ -167,12 +167,44 @@
     </w:p>
     <w:p>
       <w:r>
-        <w:t>This project is a deep-dive solo assignment at Fontys University of Applied Sciences. The subject of investigation is AI caching strategies for LLM-based applications.</w:t>
+        <w:t xml:space="preserve">This project is a deep-dive solo assignment at Fontys University of Applied Sciences. The subject of investigation is AI </w:t>
+      </w:r>
+      <w:proofErr w:type="gramStart"/>
+      <w:r>
+        <w:t>caching</w:t>
+      </w:r>
+      <w:proofErr w:type="gramEnd"/>
+      <w:r>
+        <w:t xml:space="preserve"> strategies for LLM-based applications.</w:t>
       </w:r>
     </w:p>
     <w:p>
       <w:r>
-        <w:t xml:space="preserve">The starting point is an AI-powered cybersecurity data breach analyst assistant built in Python using LangChain, OpenAI GPT-4o, ChromaDB and Streamlit. Aegis was developed across 16 incremental steps (Flavor 1), growing from a basic LLM chat interface into a full multi-agent system with RAG-based retrieval, tool use, agentic workflows, human-in-the-loop approval, multimodal input and agent-to-agent communication over HTTP. It provides a realistic LLM application to use </w:t>
+        <w:t xml:space="preserve">The starting point is an AI-powered cybersecurity data breach analyst assistant built in Python using </w:t>
+      </w:r>
+      <w:proofErr w:type="spellStart"/>
+      <w:r>
+        <w:t>LangChain</w:t>
+      </w:r>
+      <w:proofErr w:type="spellEnd"/>
+      <w:r>
+        <w:t xml:space="preserve">, OpenAI GPT-4o, </w:t>
+      </w:r>
+      <w:proofErr w:type="spellStart"/>
+      <w:r>
+        <w:t>ChromaDB</w:t>
+      </w:r>
+      <w:proofErr w:type="spellEnd"/>
+      <w:r>
+        <w:t xml:space="preserve"> and </w:t>
+      </w:r>
+      <w:proofErr w:type="spellStart"/>
+      <w:r>
+        <w:t>Streamlit</w:t>
+      </w:r>
+      <w:proofErr w:type="spellEnd"/>
+      <w:r>
+        <w:t xml:space="preserve">. Aegis was developed across 16 incremental steps (Flavor 1), growing from a basic LLM chat interface into a full multi-agent system with RAG-based retrieval, tool use, agentic workflows, human-in-the-loop approval, multimodal input and agent-to-agent communication over HTTP. It provides a realistic LLM application to use </w:t>
       </w:r>
       <w:r>
         <w:t>for</w:t>
@@ -183,13 +215,37 @@
     </w:p>
     <w:p>
       <w:r>
-        <w:t xml:space="preserve">LLM-based applications face a structural cost and latency problem: every user query triggers one or more API calls to an external model provider, each taking 1-10 seconds and incurring per-token costs. Many of these calls are for semantically similar or identical inputs. Caching is the natural solution, but naive key-value caching does not work for language </w:t>
+        <w:t xml:space="preserve">LLM-based applications face a structural cost and latency problem: every user query triggers one or more API calls to an external model provider, each taking 1-10 seconds and incurring per-token costs. Many of these calls are for semantically similar or identical inputs. Caching is the natural solution, but naive key-value </w:t>
+      </w:r>
+      <w:proofErr w:type="gramStart"/>
+      <w:r>
+        <w:t>caching</w:t>
+      </w:r>
+      <w:proofErr w:type="gramEnd"/>
+      <w:r>
+        <w:t xml:space="preserve"> does not work for language </w:t>
       </w:r>
       <w:r>
         <w:t>meaning that</w:t>
       </w:r>
       <w:r>
-        <w:t xml:space="preserve"> two queries that mean the same thing rarely have the same string. This project investigates what caching strategies are available for LLM-based systems, how they differ and which are most effective for a RAG pipeline like Aegis.</w:t>
+        <w:t xml:space="preserve"> two queries that mean the same thing rarely have the same string. This project investigates what </w:t>
+      </w:r>
+      <w:proofErr w:type="gramStart"/>
+      <w:r>
+        <w:t>caching</w:t>
+      </w:r>
+      <w:proofErr w:type="gramEnd"/>
+      <w:r>
+        <w:t xml:space="preserve"> strategies are available for LLM-based systems, how they differ and which are most effective for </w:t>
+      </w:r>
+      <w:proofErr w:type="gramStart"/>
+      <w:r>
+        <w:t>a RAG</w:t>
+      </w:r>
+      <w:proofErr w:type="gramEnd"/>
+      <w:r>
+        <w:t xml:space="preserve"> pipeline like Aegis.</w:t>
       </w:r>
     </w:p>
     <w:p>
@@ -197,7 +253,15 @@
         <w:t xml:space="preserve">To implement and evaluate caching strategies, the Aegis codebase must first be refactored into a testable, modular form. This is done by applying SOLID design principles and Test-Driven Development. Approval tests capture the current system behavior before refactoring begins, ensuring the caching implementation does not alter existing functionality. </w:t>
       </w:r>
       <w:r>
-        <w:t>A full CI/CD pipeline using GitHub Actions and Streamlit Community Cloud enforces code quality and automatic deployment.</w:t>
+        <w:t xml:space="preserve">A full CI/CD pipeline using GitHub Actions and </w:t>
+      </w:r>
+      <w:proofErr w:type="spellStart"/>
+      <w:r>
+        <w:t>Streamlit</w:t>
+      </w:r>
+      <w:proofErr w:type="spellEnd"/>
+      <w:r>
+        <w:t xml:space="preserve"> Community Cloud enforces code quality and automatic deployment.</w:t>
       </w:r>
     </w:p>
     <w:p>
@@ -224,7 +288,15 @@
         <w:pStyle w:val="ListBullet"/>
       </w:pPr>
       <w:r>
-        <w:t>Refactor the Aegis codebase using SOLID principles to create a modular, testable foundation for caching implementation.</w:t>
+        <w:t xml:space="preserve">Refactor the Aegis codebase using SOLID principles to create a modular, testable foundation for </w:t>
+      </w:r>
+      <w:proofErr w:type="gramStart"/>
+      <w:r>
+        <w:t>caching</w:t>
+      </w:r>
+      <w:proofErr w:type="gramEnd"/>
+      <w:r>
+        <w:t xml:space="preserve"> implementation.</w:t>
       </w:r>
     </w:p>
     <w:p>
@@ -261,7 +333,15 @@
     </w:p>
     <w:p>
       <w:r>
-        <w:t>Research the landscape of AI caching strategies applicable to LLM-based RAG pipelines including semantic caching, prompt caching, embedding caching, and TTL-based in-memory caching. Implement at least two candidate strategies within the Aegis pipeline and benchmark them against the uncached baseline, measuring latency reduction and cache hit rate on a representative query set.</w:t>
+        <w:t xml:space="preserve">Research the landscape of AI caching strategies applicable to LLM-based RAG pipelines including semantic caching, prompt caching, embedding caching and TTL-based in-memory caching. Implement at least two candidate strategies within the Aegis pipeline and benchmark them against the </w:t>
+      </w:r>
+      <w:proofErr w:type="spellStart"/>
+      <w:r>
+        <w:t>uncached</w:t>
+      </w:r>
+      <w:proofErr w:type="spellEnd"/>
+      <w:r>
+        <w:t xml:space="preserve"> baseline, measuring latency reduction and cache hit rate on a representative query set.</w:t>
       </w:r>
     </w:p>
     <w:p>
@@ -271,13 +351,34 @@
       <w:r>
         <w:t xml:space="preserve"> </w:t>
       </w:r>
-      <w:r>
-        <w:t>Deploy the application to Streamlit Community Cloud as the continuous deployment stage, triggered automatically when CI passes.</w:t>
+      <w:proofErr w:type="gramStart"/>
+      <w:r>
+        <w:t>Deploy</w:t>
+      </w:r>
+      <w:proofErr w:type="gramEnd"/>
+      <w:r>
+        <w:t xml:space="preserve"> the application to </w:t>
+      </w:r>
+      <w:proofErr w:type="spellStart"/>
+      <w:r>
+        <w:t>Streamlit</w:t>
+      </w:r>
+      <w:proofErr w:type="spellEnd"/>
+      <w:r>
+        <w:t xml:space="preserve"> Community Cloud as the continuous deployment stage, triggered automatically when CI passes.</w:t>
       </w:r>
     </w:p>
     <w:p>
       <w:r>
-        <w:t>Minimum requirements for the end result:</w:t>
+        <w:t xml:space="preserve">Minimum requirements for </w:t>
+      </w:r>
+      <w:proofErr w:type="gramStart"/>
+      <w:r>
+        <w:t>the end result</w:t>
+      </w:r>
+      <w:proofErr w:type="gramEnd"/>
+      <w:r>
+        <w:t>:</w:t>
       </w:r>
     </w:p>
     <w:p>
@@ -285,7 +386,15 @@
         <w:pStyle w:val="ListBullet"/>
       </w:pPr>
       <w:r>
-        <w:t xml:space="preserve">Research document comparing evaluated AI caching strategies with </w:t>
+        <w:t xml:space="preserve">Research document comparing evaluated AI </w:t>
+      </w:r>
+      <w:proofErr w:type="gramStart"/>
+      <w:r>
+        <w:t>caching</w:t>
+      </w:r>
+      <w:proofErr w:type="gramEnd"/>
+      <w:r>
+        <w:t xml:space="preserve"> strategies with </w:t>
       </w:r>
       <w:r>
         <w:t>arguments</w:t>
@@ -299,7 +408,15 @@
         <w:pStyle w:val="ListBullet"/>
       </w:pPr>
       <w:r>
-        <w:t>At least two caching strategies implemented and benchmarked against the uncached baseline.</w:t>
+        <w:t xml:space="preserve">At least two caching strategies implemented and benchmarked against the </w:t>
+      </w:r>
+      <w:proofErr w:type="spellStart"/>
+      <w:r>
+        <w:t>uncached</w:t>
+      </w:r>
+      <w:proofErr w:type="spellEnd"/>
+      <w:r>
+        <w:t xml:space="preserve"> baseline.</w:t>
       </w:r>
     </w:p>
     <w:p>
@@ -331,7 +448,15 @@
         <w:pStyle w:val="ListBullet"/>
       </w:pPr>
       <w:r>
-        <w:t>Automatic redeployment to Streamlit Community Cloud when CI passes.</w:t>
+        <w:t xml:space="preserve">Automatic redeployment to </w:t>
+      </w:r>
+      <w:proofErr w:type="spellStart"/>
+      <w:r>
+        <w:t>Streamlit</w:t>
+      </w:r>
+      <w:proofErr w:type="spellEnd"/>
+      <w:r>
+        <w:t xml:space="preserve"> Community Cloud when CI passes.</w:t>
       </w:r>
       <w:r>
         <w:br/>
@@ -391,13 +516,25 @@
         <w:pStyle w:val="ListBullet"/>
       </w:pPr>
       <w:r>
-        <w:t>Unit and integration test suite using pytest and approvaltests with a 90% coverage gate</w:t>
-      </w:r>
-      <w:r>
-        <w:t xml:space="preserve"> </w:t>
-      </w:r>
-      <w:r>
-        <w:t>GitHub Actions CI pipeline with lint, test and coverage gate stages.</w:t>
+        <w:t xml:space="preserve">Unit and integration test suite using </w:t>
+      </w:r>
+      <w:proofErr w:type="spellStart"/>
+      <w:r>
+        <w:t>pytest</w:t>
+      </w:r>
+      <w:proofErr w:type="spellEnd"/>
+      <w:r>
+        <w:t xml:space="preserve"> and </w:t>
+      </w:r>
+      <w:proofErr w:type="spellStart"/>
+      <w:proofErr w:type="gramStart"/>
+      <w:r>
+        <w:t>approvaltests</w:t>
+      </w:r>
+      <w:proofErr w:type="spellEnd"/>
+      <w:proofErr w:type="gramEnd"/>
+      <w:r>
+        <w:t xml:space="preserve"> with a 90% coverage gate GitHub Actions CI pipeline with lint, test and coverage gate stages.</w:t>
       </w:r>
     </w:p>
     <w:p>
@@ -405,7 +542,15 @@
         <w:pStyle w:val="ListBullet"/>
       </w:pPr>
       <w:r>
-        <w:t>Automatic redeployment to Streamlit Community Cloud when CI passes.</w:t>
+        <w:t xml:space="preserve">Automatic redeployment to </w:t>
+      </w:r>
+      <w:proofErr w:type="spellStart"/>
+      <w:r>
+        <w:t>Streamlit</w:t>
+      </w:r>
+      <w:proofErr w:type="spellEnd"/>
+      <w:r>
+        <w:t xml:space="preserve"> Community Cloud when CI passes.</w:t>
       </w:r>
     </w:p>
     <w:p>
@@ -413,7 +558,15 @@
         <w:pStyle w:val="ListBullet"/>
       </w:pPr>
       <w:r>
-        <w:t>Deployment of the Aegis application to Streamlit Community Cloud as the CD stage.</w:t>
+        <w:t xml:space="preserve">Deployment of the Aegis application to </w:t>
+      </w:r>
+      <w:proofErr w:type="spellStart"/>
+      <w:r>
+        <w:t>Streamlit</w:t>
+      </w:r>
+      <w:proofErr w:type="spellEnd"/>
+      <w:r>
+        <w:t xml:space="preserve"> Community Cloud as the CD stage.</w:t>
       </w:r>
     </w:p>
     <w:p>
@@ -453,7 +606,15 @@
         <w:pStyle w:val="ListBullet"/>
       </w:pPr>
       <w:r>
-        <w:t>Multi-user access, authentication or authorisation features.</w:t>
+        <w:t xml:space="preserve">Multi-user access, authentication or </w:t>
+      </w:r>
+      <w:proofErr w:type="spellStart"/>
+      <w:r>
+        <w:t>authorisation</w:t>
+      </w:r>
+      <w:proofErr w:type="spellEnd"/>
+      <w:r>
+        <w:t xml:space="preserve"> features.</w:t>
       </w:r>
     </w:p>
     <w:p>
@@ -469,7 +630,31 @@
         <w:pStyle w:val="ListBullet"/>
       </w:pPr>
       <w:r>
-        <w:t>The existing Python technology stack (LangChain, OpenAI, ChromaDB, Streamlit) must be preserved.</w:t>
+        <w:t>The existing Python technology stack (</w:t>
+      </w:r>
+      <w:proofErr w:type="spellStart"/>
+      <w:r>
+        <w:t>LangChain</w:t>
+      </w:r>
+      <w:proofErr w:type="spellEnd"/>
+      <w:r>
+        <w:t xml:space="preserve">, OpenAI, </w:t>
+      </w:r>
+      <w:proofErr w:type="spellStart"/>
+      <w:r>
+        <w:t>ChromaDB</w:t>
+      </w:r>
+      <w:proofErr w:type="spellEnd"/>
+      <w:r>
+        <w:t xml:space="preserve">, </w:t>
+      </w:r>
+      <w:proofErr w:type="spellStart"/>
+      <w:r>
+        <w:t>Streamlit</w:t>
+      </w:r>
+      <w:proofErr w:type="spellEnd"/>
+      <w:r>
+        <w:t>) must be preserved.</w:t>
       </w:r>
     </w:p>
     <w:p>
@@ -516,8 +701,13 @@
       <w:pPr>
         <w:pStyle w:val="ListBullet"/>
       </w:pPr>
-      <w:r>
-        <w:t>Caching benchmarks must use a fixed, reproducible query set to ensure results are comparable.</w:t>
+      <w:proofErr w:type="gramStart"/>
+      <w:r>
+        <w:t>Caching</w:t>
+      </w:r>
+      <w:proofErr w:type="gramEnd"/>
+      <w:r>
+        <w:t xml:space="preserve"> benchmarks must use a fixed, reproducible query set to ensure results are comparable.</w:t>
       </w:r>
     </w:p>
     <w:p>
@@ -572,8 +762,13 @@
             <w:tcW w:w="4320" w:type="dxa"/>
           </w:tcPr>
           <w:p>
-            <w:r>
-              <w:t>Caching research document</w:t>
+            <w:proofErr w:type="gramStart"/>
+            <w:r>
+              <w:t>Caching</w:t>
+            </w:r>
+            <w:proofErr w:type="gramEnd"/>
+            <w:r>
+              <w:t xml:space="preserve"> research document</w:t>
             </w:r>
           </w:p>
         </w:tc>
@@ -583,7 +778,15 @@
           </w:tcPr>
           <w:p>
             <w:r>
-              <w:t xml:space="preserve">Comparison of evaluated AI caching strategies, benchmark results </w:t>
+              <w:t xml:space="preserve">Comparison of evaluated AI </w:t>
+            </w:r>
+            <w:proofErr w:type="gramStart"/>
+            <w:r>
+              <w:t>caching</w:t>
+            </w:r>
+            <w:proofErr w:type="gramEnd"/>
+            <w:r>
+              <w:t xml:space="preserve"> strategies, benchmark results </w:t>
             </w:r>
             <w:r>
               <w:t xml:space="preserve">with arguments </w:t>
@@ -678,13 +881,15 @@
           </w:tcPr>
           <w:p>
             <w:r>
-              <w:t xml:space="preserve">GitHub Actions (CI): lint </w:t>
-            </w:r>
-            <w:r>
-              <w:t>-&gt;</w:t>
-            </w:r>
-            <w:r>
-              <w:t xml:space="preserve"> test -&gt; coverage gate on every push to main. Streamlit Community Cloud (CD): automatic redeploy when CI passes.</w:t>
+              <w:t xml:space="preserve">GitHub Actions (CI): lint -&gt; test -&gt; coverage gate on every push to main. </w:t>
+            </w:r>
+            <w:proofErr w:type="spellStart"/>
+            <w:r>
+              <w:t>Streamlit</w:t>
+            </w:r>
+            <w:proofErr w:type="spellEnd"/>
+            <w:r>
+              <w:t xml:space="preserve"> Community Cloud (CD): automatic redeploy when CI passes.</w:t>
             </w:r>
           </w:p>
         </w:tc>
@@ -886,19 +1091,15 @@
     </w:p>
     <w:p>
       <w:r>
-        <w:t>CI/CD is fully automated</w:t>
-      </w:r>
-      <w:r>
-        <w:t>,</w:t>
-      </w:r>
-      <w:r>
-        <w:t xml:space="preserve"> GitHub Actions handles continuous integration (lint, tests, 90% coverage gate) and Streamlit Community Cloud handles continuous deployment</w:t>
-      </w:r>
-      <w:r>
-        <w:t>,</w:t>
-      </w:r>
-      <w:r>
-        <w:t xml:space="preserve"> every push to main that passes CI is automatically redeployed to the live application.</w:t>
+        <w:t xml:space="preserve">CI/CD is fully automated, GitHub Actions handles continuous integration (lint, tests, 90% coverage gate) and </w:t>
+      </w:r>
+      <w:proofErr w:type="spellStart"/>
+      <w:r>
+        <w:t>Streamlit</w:t>
+      </w:r>
+      <w:proofErr w:type="spellEnd"/>
+      <w:r>
+        <w:t xml:space="preserve"> Community Cloud handles continuous deployment, every push to main that passes CI is automatically redeployed to the live application.</w:t>
       </w:r>
     </w:p>
     <w:p>
@@ -971,7 +1172,15 @@
         <w:pStyle w:val="ListBullet"/>
       </w:pPr>
       <w:r>
-        <w:t>Integration tests run against real components (ChromaDB retriever) but with the OpenAI API mocked.</w:t>
+        <w:t>Integration tests run against real components (</w:t>
+      </w:r>
+      <w:proofErr w:type="spellStart"/>
+      <w:r>
+        <w:t>ChromaDB</w:t>
+      </w:r>
+      <w:proofErr w:type="spellEnd"/>
+      <w:r>
+        <w:t xml:space="preserve"> retriever) but with the OpenAI API mocked.</w:t>
       </w:r>
     </w:p>
     <w:p>
@@ -1132,8 +1341,13 @@
             <w:r>
               <w:t xml:space="preserve"> + </w:t>
             </w:r>
-            <w:r>
-              <w:t>Streamlit Community Cloud CD setup.</w:t>
+            <w:proofErr w:type="spellStart"/>
+            <w:r>
+              <w:t>Streamlit</w:t>
+            </w:r>
+            <w:proofErr w:type="spellEnd"/>
+            <w:r>
+              <w:t xml:space="preserve"> Community Cloud CD setup.</w:t>
             </w:r>
           </w:p>
         </w:tc>
@@ -1324,10 +1538,15 @@
               <w:t xml:space="preserve"> +</w:t>
             </w:r>
             <w:r>
-              <w:t xml:space="preserve"> </w:t>
-            </w:r>
-            <w:r>
-              <w:t>set up Streamlit Community Cloud CD</w:t>
+              <w:t xml:space="preserve"> set up </w:t>
+            </w:r>
+            <w:proofErr w:type="spellStart"/>
+            <w:r>
+              <w:t>Streamlit</w:t>
+            </w:r>
+            <w:proofErr w:type="spellEnd"/>
+            <w:r>
+              <w:t xml:space="preserve"> Community Cloud CD</w:t>
             </w:r>
             <w:r>
               <w:t xml:space="preserve"> + </w:t>
@@ -1384,7 +1603,15 @@
               <w:t xml:space="preserve"> +</w:t>
             </w:r>
             <w:r>
-              <w:t xml:space="preserve"> benchmark both against uncached baseline</w:t>
+              <w:t xml:space="preserve"> benchmark both against </w:t>
+            </w:r>
+            <w:proofErr w:type="spellStart"/>
+            <w:r>
+              <w:t>uncached</w:t>
+            </w:r>
+            <w:proofErr w:type="spellEnd"/>
+            <w:r>
+              <w:t xml:space="preserve"> baseline</w:t>
             </w:r>
             <w:r>
               <w:t xml:space="preserve"> +</w:t>
@@ -1504,8 +1731,13 @@
           </w:tcPr>
           <w:p>
             <w:r>
-              <w:t>Erik van der Schriek</w:t>
-            </w:r>
+              <w:t xml:space="preserve">Erik van der </w:t>
+            </w:r>
+            <w:proofErr w:type="spellStart"/>
+            <w:r>
+              <w:t>Schriek</w:t>
+            </w:r>
+            <w:proofErr w:type="spellEnd"/>
           </w:p>
         </w:tc>
         <w:tc>
@@ -1646,8 +1878,13 @@
           </w:tcPr>
           <w:p>
             <w:r>
-              <w:t>Windows 11, Python 3.11, venv</w:t>
-            </w:r>
+              <w:t xml:space="preserve">Windows 11, Python 3.11, </w:t>
+            </w:r>
+            <w:proofErr w:type="spellStart"/>
+            <w:r>
+              <w:t>venv</w:t>
+            </w:r>
+            <w:proofErr w:type="spellEnd"/>
           </w:p>
         </w:tc>
         <w:tc>
@@ -1677,8 +1914,13 @@
             <w:tcW w:w="2880" w:type="dxa"/>
           </w:tcPr>
           <w:p>
-            <w:r>
-              <w:t>ChromaDB persistent (local disk)</w:t>
+            <w:proofErr w:type="spellStart"/>
+            <w:r>
+              <w:t>ChromaDB</w:t>
+            </w:r>
+            <w:proofErr w:type="spellEnd"/>
+            <w:r>
+              <w:t xml:space="preserve"> persistent (local disk)</w:t>
             </w:r>
           </w:p>
         </w:tc>
@@ -1687,8 +1929,13 @@
             <w:tcW w:w="2880" w:type="dxa"/>
           </w:tcPr>
           <w:p>
-            <w:r>
-              <w:t>ChromaDB in-memory instance</w:t>
+            <w:proofErr w:type="spellStart"/>
+            <w:r>
+              <w:t>ChromaDB</w:t>
+            </w:r>
+            <w:proofErr w:type="spellEnd"/>
+            <w:r>
+              <w:t xml:space="preserve"> in-memory instance</w:t>
             </w:r>
           </w:p>
         </w:tc>
@@ -1784,8 +2031,13 @@
           </w:tcPr>
           <w:p>
             <w:r>
-              <w:t>Started as subprocess pytest</w:t>
-            </w:r>
+              <w:t xml:space="preserve">Started as subprocess </w:t>
+            </w:r>
+            <w:proofErr w:type="spellStart"/>
+            <w:r>
+              <w:t>pytest</w:t>
+            </w:r>
+            <w:proofErr w:type="spellEnd"/>
           </w:p>
         </w:tc>
       </w:tr>
@@ -1805,8 +2057,13 @@
             <w:tcW w:w="2880" w:type="dxa"/>
           </w:tcPr>
           <w:p>
-            <w:r>
-              <w:t>pytest (local)</w:t>
+            <w:proofErr w:type="spellStart"/>
+            <w:r>
+              <w:t>pytest</w:t>
+            </w:r>
+            <w:proofErr w:type="spellEnd"/>
+            <w:r>
+              <w:t xml:space="preserve"> (local)</w:t>
             </w:r>
           </w:p>
         </w:tc>
@@ -1815,8 +2072,13 @@
             <w:tcW w:w="2880" w:type="dxa"/>
           </w:tcPr>
           <w:p>
-            <w:r>
-              <w:t>pytest via GitHub Actions workflow</w:t>
+            <w:proofErr w:type="spellStart"/>
+            <w:r>
+              <w:t>pytest</w:t>
+            </w:r>
+            <w:proofErr w:type="spellEnd"/>
+            <w:r>
+              <w:t xml:space="preserve"> via GitHub Actions workflow</w:t>
             </w:r>
           </w:p>
         </w:tc>
@@ -1847,12 +2109,19 @@
             <w:tcW w:w="2880" w:type="dxa"/>
           </w:tcPr>
           <w:p>
-            <w:r>
-              <w:t>Streamlit Community Cloud</w:t>
-            </w:r>
-            <w:r>
-              <w:t xml:space="preserve"> autodeploy</w:t>
-            </w:r>
+            <w:proofErr w:type="spellStart"/>
+            <w:r>
+              <w:t>Streamlit</w:t>
+            </w:r>
+            <w:proofErr w:type="spellEnd"/>
+            <w:r>
+              <w:t xml:space="preserve"> Community Cloud </w:t>
+            </w:r>
+            <w:proofErr w:type="spellStart"/>
+            <w:r>
+              <w:t>autodeploy</w:t>
+            </w:r>
+            <w:proofErr w:type="spellEnd"/>
           </w:p>
         </w:tc>
       </w:tr>
@@ -1906,7 +2175,31 @@
         <w:pStyle w:val="ListBullet"/>
       </w:pPr>
       <w:r>
-        <w:t>Commit convention: Conventional Commits (feat:, fix:, test:, refactor:).</w:t>
+        <w:t>Commit convention: Conventional Commits (</w:t>
+      </w:r>
+      <w:proofErr w:type="gramStart"/>
+      <w:r>
+        <w:t>feat:,</w:t>
+      </w:r>
+      <w:proofErr w:type="gramEnd"/>
+      <w:r>
+        <w:t xml:space="preserve"> </w:t>
+      </w:r>
+      <w:proofErr w:type="gramStart"/>
+      <w:r>
+        <w:t>fix:,</w:t>
+      </w:r>
+      <w:proofErr w:type="gramEnd"/>
+      <w:r>
+        <w:t xml:space="preserve"> </w:t>
+      </w:r>
+      <w:proofErr w:type="gramStart"/>
+      <w:r>
+        <w:t>test:,</w:t>
+      </w:r>
+      <w:proofErr w:type="gramEnd"/>
+      <w:r>
+        <w:t xml:space="preserve"> refactor:).</w:t>
       </w:r>
     </w:p>
     <w:p>
@@ -1922,11 +2215,21 @@
       <w:pPr>
         <w:pStyle w:val="ListBullet"/>
       </w:pPr>
-      <w:r>
-        <w:t xml:space="preserve">Streamlit Community Cloud connected to the GitHub repository </w:t>
-      </w:r>
-      <w:r>
-        <w:t>and autodeploys when pushing to main</w:t>
+      <w:proofErr w:type="spellStart"/>
+      <w:r>
+        <w:t>Streamlit</w:t>
+      </w:r>
+      <w:proofErr w:type="spellEnd"/>
+      <w:r>
+        <w:t xml:space="preserve"> Community Cloud connected to the GitHub repository and </w:t>
+      </w:r>
+      <w:proofErr w:type="spellStart"/>
+      <w:r>
+        <w:t>autodeploys</w:t>
+      </w:r>
+      <w:proofErr w:type="spellEnd"/>
+      <w:r>
+        <w:t xml:space="preserve"> when pushing to main</w:t>
       </w:r>
     </w:p>
     <w:p>
@@ -2064,7 +2367,15 @@
           </w:tcPr>
           <w:p>
             <w:r>
-              <w:t>Fixed query set run against uncached baseline + each cached variant. Bounded cost.</w:t>
+              <w:t xml:space="preserve">Fixed query set run against </w:t>
+            </w:r>
+            <w:proofErr w:type="spellStart"/>
+            <w:r>
+              <w:t>uncached</w:t>
+            </w:r>
+            <w:proofErr w:type="spellEnd"/>
+            <w:r>
+              <w:t xml:space="preserve"> baseline + each cached variant. Bounded cost.</w:t>
             </w:r>
           </w:p>
         </w:tc>
@@ -2096,7 +2407,15 @@
           </w:tcPr>
           <w:p>
             <w:r>
-              <w:t>Free tier is sufficient for a solo project.</w:t>
+              <w:t xml:space="preserve">Free </w:t>
+            </w:r>
+            <w:proofErr w:type="gramStart"/>
+            <w:r>
+              <w:t>tier</w:t>
+            </w:r>
+            <w:proofErr w:type="gramEnd"/>
+            <w:r>
+              <w:t xml:space="preserve"> is sufficient for a solo project.</w:t>
             </w:r>
           </w:p>
         </w:tc>
@@ -2139,8 +2458,13 @@
             <w:tcW w:w="2880" w:type="dxa"/>
           </w:tcPr>
           <w:p>
-            <w:r>
-              <w:t>Streamlit Community Cloud</w:t>
+            <w:proofErr w:type="spellStart"/>
+            <w:r>
+              <w:t>Streamlit</w:t>
+            </w:r>
+            <w:proofErr w:type="spellEnd"/>
+            <w:r>
+              <w:t xml:space="preserve"> Community Cloud</w:t>
             </w:r>
           </w:p>
         </w:tc>
@@ -2160,7 +2484,15 @@
           </w:tcPr>
           <w:p>
             <w:r>
-              <w:t>Free tier sufficient for a solo project.</w:t>
+              <w:t xml:space="preserve">Free </w:t>
+            </w:r>
+            <w:proofErr w:type="gramStart"/>
+            <w:r>
+              <w:t>tier</w:t>
+            </w:r>
+            <w:proofErr w:type="gramEnd"/>
+            <w:r>
+              <w:t xml:space="preserve"> sufficient for a solo project.</w:t>
             </w:r>
           </w:p>
         </w:tc>

</xml_diff>